<commit_message>
Licitacion 215088: carta en Word con los cinco renglones ya puestos
La tabla de renglones sale llena con el producto, el modelo y la talla de
cada uno, y deja constancia de que el renglon 1 no se oferta. La casilla del
numeral 9.1.1 queda marcada en sus dos opciones: SI para el renglon 3, donde
se oferta el producto de referencia de la ACP, y NO para los renglones 2, 4,
5 y 6. Siguen en blanco los ocho datos legales del proponente.

Co-Authored-By: Claude Opus 5 <noreply@anthropic.com>
Claude-Session: https://claude.ai/code/session_01EKNGokwqz1csBHm9s8jAFm
</commit_message>
<xml_diff>
--- a/licitaciones/215088-guantes-acp/word/CARTA-PRESENTACION-215088.docx
+++ b/licitaciones/215088-guantes-acp/word/CARTA-PRESENTACION-215088.docx
@@ -1113,7 +1113,7 @@
                 <w:sz w:val="19"/>
                 <w:szCs w:val="19"/>
               </w:rPr>
-              <w:t xml:space="preserve">1</w:t>
+              <w:t xml:space="preserve">2</w:t>
             </w:r>
           </w:p>
         </w:tc>
@@ -1145,7 +1145,7 @@
                 <w:sz w:val="16"/>
                 <w:szCs w:val="16"/>
               </w:rPr>
-              <w:t xml:space="preserve">PPE-GLO-00006</w:t>
+              <w:t xml:space="preserve">PPE-GLO-00012</w:t>
             </w:r>
           </w:p>
         </w:tc>
@@ -1177,7 +1177,7 @@
                 <w:sz w:val="16"/>
                 <w:szCs w:val="16"/>
               </w:rPr>
-              <w:t xml:space="preserve">Guante dieléctrico de baja tensión, talla 10</w:t>
+              <w:t xml:space="preserve">Guante químico industrial, talla 9 (large)</w:t>
             </w:r>
           </w:p>
         </w:tc>
@@ -1209,7 +1209,7 @@
                 <w:sz w:val="16"/>
                 <w:szCs w:val="16"/>
               </w:rPr>
-              <w:t xml:space="preserve">24 Pr</w:t>
+              <w:t xml:space="preserve">1,500 Pr</w:t>
             </w:r>
           </w:p>
         </w:tc>
@@ -1234,12 +1234,34 @@
                 <w:rFonts w:ascii="Arial" w:cs="Arial" w:eastAsia="Arial" w:hAnsi="Arial"/>
                 <w:b/>
                 <w:bCs/>
-                <w:color w:val="2F5BA8"/>
-                <w:sz w:val="18"/>
-                <w:szCs w:val="18"/>
-                <w:u w:val="single"/>
-              </w:rPr>
-              <w:t xml:space="preserve">                              </w:t>
+                <w:i w:val="false"/>
+                <w:iCs w:val="false"/>
+                <w:caps w:val="false"/>
+                <w:color w:val="1A1A1A"/>
+                <w:sz w:val="16"/>
+                <w:szCs w:val="16"/>
+              </w:rPr>
+              <w:t xml:space="preserve">Elite Guard Guante de nitrilo corto J710</w:t>
+            </w:r>
+          </w:p>
+          <w:p>
+            <w:pPr>
+              <w:spacing w:after="20" w:before="20"/>
+              <w:jc w:val="left"/>
+            </w:pPr>
+            <w:r>
+              <w:rPr>
+                <w:rFonts w:ascii="Arial" w:cs="Arial" w:eastAsia="Arial" w:hAnsi="Arial"/>
+                <w:b w:val="false"/>
+                <w:bCs w:val="false"/>
+                <w:i w:val="false"/>
+                <w:iCs w:val="false"/>
+                <w:caps w:val="false"/>
+                <w:color w:val="5A5A5A"/>
+                <w:sz w:val="15"/>
+                <w:szCs w:val="15"/>
+              </w:rPr>
+              <w:t xml:space="preserve">Talla 9 (Large)</w:t>
             </w:r>
           </w:p>
         </w:tc>
@@ -1273,7 +1295,7 @@
                 <w:sz w:val="19"/>
                 <w:szCs w:val="19"/>
               </w:rPr>
-              <w:t xml:space="preserve">2</w:t>
+              <w:t xml:space="preserve">3</w:t>
             </w:r>
           </w:p>
         </w:tc>
@@ -1305,7 +1327,7 @@
                 <w:sz w:val="16"/>
                 <w:szCs w:val="16"/>
               </w:rPr>
-              <w:t xml:space="preserve">PPE-GLO-00012</w:t>
+              <w:t xml:space="preserve">PPE-GLO-00020</w:t>
             </w:r>
           </w:p>
         </w:tc>
@@ -1337,7 +1359,7 @@
                 <w:sz w:val="16"/>
                 <w:szCs w:val="16"/>
               </w:rPr>
-              <w:t xml:space="preserve">Guante químico industrial, large</w:t>
+              <w:t xml:space="preserve">Guante punteado de Kevlar®, hombre, talla 10 X-Large</w:t>
             </w:r>
           </w:p>
         </w:tc>
@@ -1369,7 +1391,7 @@
                 <w:sz w:val="16"/>
                 <w:szCs w:val="16"/>
               </w:rPr>
-              <w:t xml:space="preserve">1,500 Pr</w:t>
+              <w:t xml:space="preserve">960 Pr</w:t>
             </w:r>
           </w:p>
         </w:tc>
@@ -1394,12 +1416,34 @@
                 <w:rFonts w:ascii="Arial" w:cs="Arial" w:eastAsia="Arial" w:hAnsi="Arial"/>
                 <w:b/>
                 <w:bCs/>
-                <w:color w:val="2F5BA8"/>
-                <w:sz w:val="18"/>
-                <w:szCs w:val="18"/>
-                <w:u w:val="single"/>
-              </w:rPr>
-              <w:t xml:space="preserve">                              </w:t>
+                <w:i w:val="false"/>
+                <w:iCs w:val="false"/>
+                <w:caps w:val="false"/>
+                <w:color w:val="1A1A1A"/>
+                <w:sz w:val="16"/>
+                <w:szCs w:val="16"/>
+              </w:rPr>
+              <w:t xml:space="preserve">MCR Safety CutPro® 9366</w:t>
+            </w:r>
+          </w:p>
+          <w:p>
+            <w:pPr>
+              <w:spacing w:after="20" w:before="20"/>
+              <w:jc w:val="left"/>
+            </w:pPr>
+            <w:r>
+              <w:rPr>
+                <w:rFonts w:ascii="Arial" w:cs="Arial" w:eastAsia="Arial" w:hAnsi="Arial"/>
+                <w:b w:val="false"/>
+                <w:bCs w:val="false"/>
+                <w:i w:val="false"/>
+                <w:iCs w:val="false"/>
+                <w:caps w:val="false"/>
+                <w:color w:val="5A5A5A"/>
+                <w:sz w:val="15"/>
+                <w:szCs w:val="15"/>
+              </w:rPr>
+              <w:t xml:space="preserve">Talla 10 (X-Large)</w:t>
             </w:r>
           </w:p>
         </w:tc>
@@ -1433,7 +1477,7 @@
                 <w:sz w:val="19"/>
                 <w:szCs w:val="19"/>
               </w:rPr>
-              <w:t xml:space="preserve">3</w:t>
+              <w:t xml:space="preserve">4</w:t>
             </w:r>
           </w:p>
         </w:tc>
@@ -1465,7 +1509,7 @@
                 <w:sz w:val="16"/>
                 <w:szCs w:val="16"/>
               </w:rPr>
-              <w:t xml:space="preserve">PPE-GLO-00020</w:t>
+              <w:t xml:space="preserve">PPE-GLO-00022</w:t>
             </w:r>
           </w:p>
         </w:tc>
@@ -1497,7 +1541,7 @@
                 <w:sz w:val="16"/>
                 <w:szCs w:val="16"/>
               </w:rPr>
-              <w:t xml:space="preserve">Guante punteado de Kevlar®, hombre, talla 10 X-Large</w:t>
+              <w:t xml:space="preserve">Guante de examen de nitrilo, mediano, caja de 50 a 100</w:t>
             </w:r>
           </w:p>
         </w:tc>
@@ -1529,7 +1573,7 @@
                 <w:sz w:val="16"/>
                 <w:szCs w:val="16"/>
               </w:rPr>
-              <w:t xml:space="preserve">960 Pr</w:t>
+              <w:t xml:space="preserve">1,000 Box</w:t>
             </w:r>
           </w:p>
         </w:tc>
@@ -1558,30 +1602,30 @@
                 <w:iCs w:val="false"/>
                 <w:caps w:val="false"/>
                 <w:color w:val="1A1A1A"/>
-                <w:sz w:val="17"/>
-                <w:szCs w:val="17"/>
-              </w:rPr>
-              <w:t xml:space="preserve">MCR Safety CutPro® 9366</w:t>
-            </w:r>
-          </w:p>
-          <w:p>
-            <w:pPr>
-              <w:spacing w:after="20" w:before="20"/>
-              <w:jc w:val="left"/>
-            </w:pPr>
-            <w:r>
-              <w:rPr>
-                <w:rFonts w:ascii="Arial" w:cs="Arial" w:eastAsia="Arial" w:hAnsi="Arial"/>
-                <w:b w:val="false"/>
-                <w:bCs w:val="false"/>
-                <w:i w:val="false"/>
-                <w:iCs w:val="false"/>
-                <w:caps w:val="false"/>
-                <w:color w:val="5A5A5A"/>
                 <w:sz w:val="16"/>
                 <w:szCs w:val="16"/>
               </w:rPr>
-              <w:t xml:space="preserve">Talla 10 (X-Large)</w:t>
+              <w:t xml:space="preserve">MCR Safety Nitrilo desechable 6008</w:t>
+            </w:r>
+          </w:p>
+          <w:p>
+            <w:pPr>
+              <w:spacing w:after="20" w:before="20"/>
+              <w:jc w:val="left"/>
+            </w:pPr>
+            <w:r>
+              <w:rPr>
+                <w:rFonts w:ascii="Arial" w:cs="Arial" w:eastAsia="Arial" w:hAnsi="Arial"/>
+                <w:b w:val="false"/>
+                <w:bCs w:val="false"/>
+                <w:i w:val="false"/>
+                <w:iCs w:val="false"/>
+                <w:caps w:val="false"/>
+                <w:color w:val="5A5A5A"/>
+                <w:sz w:val="15"/>
+                <w:szCs w:val="15"/>
+              </w:rPr>
+              <w:t xml:space="preserve">Talla mediana (M)</w:t>
             </w:r>
           </w:p>
         </w:tc>
@@ -1615,7 +1659,7 @@
                 <w:sz w:val="19"/>
                 <w:szCs w:val="19"/>
               </w:rPr>
-              <w:t xml:space="preserve">4</w:t>
+              <w:t xml:space="preserve">5</w:t>
             </w:r>
           </w:p>
         </w:tc>
@@ -1647,7 +1691,7 @@
                 <w:sz w:val="16"/>
                 <w:szCs w:val="16"/>
               </w:rPr>
-              <w:t xml:space="preserve">PPE-GLO-00022</w:t>
+              <w:t xml:space="preserve">PPE-GLO-00031</w:t>
             </w:r>
           </w:p>
         </w:tc>
@@ -1679,7 +1723,7 @@
                 <w:sz w:val="16"/>
                 <w:szCs w:val="16"/>
               </w:rPr>
-              <w:t xml:space="preserve">Guante de examen de nitrilo, mediano, caja de 50 a 100</w:t>
+              <w:t xml:space="preserve">Guante anticorte ANSI A4 / EN 388 4-X-4-2-C, talla 9</w:t>
             </w:r>
           </w:p>
         </w:tc>
@@ -1711,7 +1755,7 @@
                 <w:sz w:val="16"/>
                 <w:szCs w:val="16"/>
               </w:rPr>
-              <w:t xml:space="preserve">1,000 Box</w:t>
+              <w:t xml:space="preserve">5,000 Each</w:t>
             </w:r>
           </w:p>
         </w:tc>
@@ -1736,12 +1780,34 @@
                 <w:rFonts w:ascii="Arial" w:cs="Arial" w:eastAsia="Arial" w:hAnsi="Arial"/>
                 <w:b/>
                 <w:bCs/>
-                <w:color w:val="2F5BA8"/>
-                <w:sz w:val="18"/>
-                <w:szCs w:val="18"/>
-                <w:u w:val="single"/>
-              </w:rPr>
-              <w:t xml:space="preserve">                              </w:t>
+                <w:i w:val="false"/>
+                <w:iCs w:val="false"/>
+                <w:caps w:val="false"/>
+                <w:color w:val="1A1A1A"/>
+                <w:sz w:val="16"/>
+                <w:szCs w:val="16"/>
+              </w:rPr>
+              <w:t xml:space="preserve">MCR Safety CutPro® 92754BP</w:t>
+            </w:r>
+          </w:p>
+          <w:p>
+            <w:pPr>
+              <w:spacing w:after="20" w:before="20"/>
+              <w:jc w:val="left"/>
+            </w:pPr>
+            <w:r>
+              <w:rPr>
+                <w:rFonts w:ascii="Arial" w:cs="Arial" w:eastAsia="Arial" w:hAnsi="Arial"/>
+                <w:b w:val="false"/>
+                <w:bCs w:val="false"/>
+                <w:i w:val="false"/>
+                <w:iCs w:val="false"/>
+                <w:caps w:val="false"/>
+                <w:color w:val="5A5A5A"/>
+                <w:sz w:val="15"/>
+                <w:szCs w:val="15"/>
+              </w:rPr>
+              <w:t xml:space="preserve">Talla 9 (Large)</w:t>
             </w:r>
           </w:p>
         </w:tc>
@@ -1775,7 +1841,7 @@
                 <w:sz w:val="19"/>
                 <w:szCs w:val="19"/>
               </w:rPr>
-              <w:t xml:space="preserve">5</w:t>
+              <w:t xml:space="preserve">6</w:t>
             </w:r>
           </w:p>
         </w:tc>
@@ -1807,7 +1873,7 @@
                 <w:sz w:val="16"/>
                 <w:szCs w:val="16"/>
               </w:rPr>
-              <w:t xml:space="preserve">PPE-GLO-00031</w:t>
+              <w:t xml:space="preserve">PPE-GLO-00033</w:t>
             </w:r>
           </w:p>
         </w:tc>
@@ -1839,7 +1905,7 @@
                 <w:sz w:val="16"/>
                 <w:szCs w:val="16"/>
               </w:rPr>
-              <w:t xml:space="preserve">Guante anticorte ANSI A4 / EN 388 4-X-4-2-C, talla 9</w:t>
+              <w:t xml:space="preserve">Guante tejido con palma y yemas de PU, talla 11</w:t>
             </w:r>
           </w:p>
         </w:tc>
@@ -1871,7 +1937,7 @@
                 <w:sz w:val="16"/>
                 <w:szCs w:val="16"/>
               </w:rPr>
-              <w:t xml:space="preserve">5,000 Each</w:t>
+              <w:t xml:space="preserve">«____» Each</w:t>
             </w:r>
           </w:p>
         </w:tc>
@@ -1896,70 +1962,6 @@
                 <w:rFonts w:ascii="Arial" w:cs="Arial" w:eastAsia="Arial" w:hAnsi="Arial"/>
                 <w:b/>
                 <w:bCs/>
-                <w:color w:val="2F5BA8"/>
-                <w:sz w:val="18"/>
-                <w:szCs w:val="18"/>
-                <w:u w:val="single"/>
-              </w:rPr>
-              <w:t xml:space="preserve">                              </w:t>
-            </w:r>
-          </w:p>
-        </w:tc>
-      </w:tr>
-      <w:tr>
-        <w:tc>
-          <w:tcPr>
-            <w:tcW w:type="dxa" w:w="1000"/>
-            <w:tcMar>
-              <w:top w:type="dxa" w:w="90"/>
-              <w:left w:type="dxa" w:w="140"/>
-              <w:bottom w:type="dxa" w:w="90"/>
-              <w:right w:type="dxa" w:w="140"/>
-            </w:tcMar>
-            <w:vAlign w:val="center"/>
-          </w:tcPr>
-          <w:p>
-            <w:pPr>
-              <w:spacing w:after="20" w:before="20"/>
-              <w:jc w:val="center"/>
-            </w:pPr>
-            <w:r>
-              <w:rPr>
-                <w:rFonts w:ascii="Arial" w:cs="Arial" w:eastAsia="Arial" w:hAnsi="Arial"/>
-                <w:b/>
-                <w:bCs/>
-                <w:i w:val="false"/>
-                <w:iCs w:val="false"/>
-                <w:caps w:val="false"/>
-                <w:color w:val="1A1A1A"/>
-                <w:sz w:val="19"/>
-                <w:szCs w:val="19"/>
-              </w:rPr>
-              <w:t xml:space="preserve">6</w:t>
-            </w:r>
-          </w:p>
-        </w:tc>
-        <w:tc>
-          <w:tcPr>
-            <w:tcW w:type="dxa" w:w="1900"/>
-            <w:tcMar>
-              <w:top w:type="dxa" w:w="90"/>
-              <w:left w:type="dxa" w:w="140"/>
-              <w:bottom w:type="dxa" w:w="90"/>
-              <w:right w:type="dxa" w:w="140"/>
-            </w:tcMar>
-            <w:vAlign w:val="center"/>
-          </w:tcPr>
-          <w:p>
-            <w:pPr>
-              <w:spacing w:after="20" w:before="20"/>
-              <w:jc w:val="left"/>
-            </w:pPr>
-            <w:r>
-              <w:rPr>
-                <w:rFonts w:ascii="Arial" w:cs="Arial" w:eastAsia="Arial" w:hAnsi="Arial"/>
-                <w:b w:val="false"/>
-                <w:bCs w:val="false"/>
                 <w:i w:val="false"/>
                 <w:iCs w:val="false"/>
                 <w:caps w:val="false"/>
@@ -1967,101 +1969,27 @@
                 <w:sz w:val="16"/>
                 <w:szCs w:val="16"/>
               </w:rPr>
-              <w:t xml:space="preserve">PPE-GLO-00033</w:t>
-            </w:r>
-          </w:p>
-        </w:tc>
-        <w:tc>
-          <w:tcPr>
-            <w:tcW w:type="dxa" w:w="3900"/>
-            <w:tcMar>
-              <w:top w:type="dxa" w:w="90"/>
-              <w:left w:type="dxa" w:w="140"/>
-              <w:bottom w:type="dxa" w:w="90"/>
-              <w:right w:type="dxa" w:w="140"/>
-            </w:tcMar>
-            <w:vAlign w:val="top"/>
-          </w:tcPr>
-          <w:p>
-            <w:pPr>
-              <w:spacing w:after="20" w:before="20"/>
-              <w:jc w:val="left"/>
-            </w:pPr>
-            <w:r>
-              <w:rPr>
-                <w:rFonts w:ascii="Arial" w:cs="Arial" w:eastAsia="Arial" w:hAnsi="Arial"/>
-                <w:b w:val="false"/>
-                <w:bCs w:val="false"/>
-                <w:i w:val="false"/>
-                <w:iCs w:val="false"/>
-                <w:caps w:val="false"/>
-                <w:color w:val="1A1A1A"/>
-                <w:sz w:val="16"/>
-                <w:szCs w:val="16"/>
-              </w:rPr>
-              <w:t xml:space="preserve">Guante tejido con palma y yemas de PU, talla 11</w:t>
-            </w:r>
-          </w:p>
-        </w:tc>
-        <w:tc>
-          <w:tcPr>
-            <w:tcW w:type="dxa" w:w="1300"/>
-            <w:tcMar>
-              <w:top w:type="dxa" w:w="90"/>
-              <w:left w:type="dxa" w:w="140"/>
-              <w:bottom w:type="dxa" w:w="90"/>
-              <w:right w:type="dxa" w:w="140"/>
-            </w:tcMar>
-            <w:vAlign w:val="center"/>
-          </w:tcPr>
-          <w:p>
-            <w:pPr>
-              <w:spacing w:after="20" w:before="20"/>
-              <w:jc w:val="center"/>
-            </w:pPr>
-            <w:r>
-              <w:rPr>
-                <w:rFonts w:ascii="Arial" w:cs="Arial" w:eastAsia="Arial" w:hAnsi="Arial"/>
-                <w:b w:val="false"/>
-                <w:bCs w:val="false"/>
-                <w:i w:val="false"/>
-                <w:iCs w:val="false"/>
-                <w:caps w:val="false"/>
-                <w:color w:val="1A1A1A"/>
-                <w:sz w:val="16"/>
-                <w:szCs w:val="16"/>
-              </w:rPr>
-              <w:t xml:space="preserve">_______</w:t>
-            </w:r>
-          </w:p>
-        </w:tc>
-        <w:tc>
-          <w:tcPr>
-            <w:tcW w:type="dxa" w:w="2700"/>
-            <w:tcMar>
-              <w:top w:type="dxa" w:w="90"/>
-              <w:left w:type="dxa" w:w="140"/>
-              <w:bottom w:type="dxa" w:w="90"/>
-              <w:right w:type="dxa" w:w="140"/>
-            </w:tcMar>
-            <w:vAlign w:val="top"/>
-          </w:tcPr>
-          <w:p>
-            <w:pPr>
-              <w:spacing w:after="20" w:before="20"/>
-              <w:jc w:val="left"/>
-            </w:pPr>
-            <w:r>
-              <w:rPr>
-                <w:rFonts w:ascii="Arial" w:cs="Arial" w:eastAsia="Arial" w:hAnsi="Arial"/>
-                <w:b/>
-                <w:bCs/>
-                <w:color w:val="2F5BA8"/>
-                <w:sz w:val="18"/>
-                <w:szCs w:val="18"/>
-                <w:u w:val="single"/>
-              </w:rPr>
-              <w:t xml:space="preserve">                              </w:t>
+              <w:t xml:space="preserve">MCR Safety CutPro® 92852PU</w:t>
+            </w:r>
+          </w:p>
+          <w:p>
+            <w:pPr>
+              <w:spacing w:after="20" w:before="20"/>
+              <w:jc w:val="left"/>
+            </w:pPr>
+            <w:r>
+              <w:rPr>
+                <w:rFonts w:ascii="Arial" w:cs="Arial" w:eastAsia="Arial" w:hAnsi="Arial"/>
+                <w:b w:val="false"/>
+                <w:bCs w:val="false"/>
+                <w:i w:val="false"/>
+                <w:iCs w:val="false"/>
+                <w:caps w:val="false"/>
+                <w:color w:val="5A5A5A"/>
+                <w:sz w:val="15"/>
+                <w:szCs w:val="15"/>
+              </w:rPr>
+              <w:t xml:space="preserve">Talla 11 (2X-Large)</w:t>
             </w:r>
           </w:p>
         </w:tc>
@@ -2096,7 +2024,7 @@
           <w:sz w:val="16"/>
           <w:szCs w:val="16"/>
         </w:rPr>
-        <w:t xml:space="preserve">Elimine de esta tabla los renglones que no vaya a ofertar. La adjudicación es por precio más bajo POR RENGLÓN, de modo que se puede ofertar parcialmente.</w:t>
+        <w:t xml:space="preserve">No se oferta el renglón 1 (guante dieléctrico de baja tensión), por no contar el proponente con producto que cumpla la descripción. La adjudicación es por precio más bajo POR RENGLÓN, por lo que la propuesta se presenta sobre los cinco renglones restantes.</w:t>
       </w:r>
     </w:p>
     <w:tbl>
@@ -2172,7 +2100,7 @@
           <w:sz w:val="19"/>
           <w:szCs w:val="19"/>
         </w:rPr>
-        <w:t xml:space="preserve">El proponente </w:t>
+        <w:t xml:space="preserve">[ X ]   El proponente </w:t>
       </w:r>
       <w:r>
         <w:rPr>
@@ -2198,10 +2126,9 @@
           <w:rFonts w:ascii="Arial" w:cs="Arial" w:eastAsia="Arial" w:hAnsi="Arial"/>
           <w:b/>
           <w:bCs/>
-          <w:color w:val="2F5BA8"/>
+          <w:color w:val="1A1A1A"/>
           <w:sz w:val="19"/>
           <w:szCs w:val="19"/>
-          <w:u w:val="single"/>
         </w:rPr>
         <w:t xml:space="preserve">     3     </w:t>
       </w:r>
@@ -2225,7 +2152,7 @@
           <w:sz w:val="19"/>
           <w:szCs w:val="19"/>
         </w:rPr>
-        <w:t xml:space="preserve">El proponente </w:t>
+        <w:t xml:space="preserve">[ X ]   El proponente </w:t>
       </w:r>
       <w:r>
         <w:rPr>
@@ -2251,12 +2178,11 @@
           <w:rFonts w:ascii="Arial" w:cs="Arial" w:eastAsia="Arial" w:hAnsi="Arial"/>
           <w:b/>
           <w:bCs/>
-          <w:color w:val="2F5BA8"/>
+          <w:color w:val="1A1A1A"/>
           <w:sz w:val="19"/>
           <w:szCs w:val="19"/>
-          <w:u w:val="single"/>
         </w:rPr>
-        <w:t xml:space="preserve">                    </w:t>
+        <w:t xml:space="preserve">     2, 4, 5 y 6     </w:t>
       </w:r>
       <w:r>
         <w:rPr>

</xml_diff>

<commit_message>
Licitacion 215088: fichas resaltadas, datos del proponente y sin pais de origen
Se quita el pais de origen de la propuesta economica: el pliego no lo pide en
ningun numeral. El 1.6 exige marca, modelo y numero de parte, y eso queda
explicito en cada renglon.

Entran los datos de Elite Guard S.A., RUC 155742060-2-2023 DV 50, Michael
Rosenthal y la fecha del 6 de octubre en la carta, la economica y los cinco
PDF de renglon.

Las cinco fichas del fabricante quedan rotuladas con su renglon y con las
caracteristicas de cumplimiento resaltadas y numeradas. El resaltado pasa a
dibujarse encima y translucido porque algunas fichas traen fondo opaco que
tapaba el dibujado por debajo.

El conteo de caja del renglon 4 sale de la propia ficha: 50 por dispensadora,
dentro del rango de 50 a 100 que exige el renglon.

Co-Authored-By: Claude Opus 5 <noreply@anthropic.com>
Claude-Session: https://claude.ai/code/session_01EKNGokwqz1csBHm9s8jAFm
</commit_message>
<xml_diff>
--- a/licitaciones/215088-guantes-acp/word/CARTA-PRESENTACION-215088.docx
+++ b/licitaciones/215088-guantes-acp/word/CARTA-PRESENTACION-215088.docx
@@ -310,7 +310,141 @@
                 <w:sz w:val="14"/>
                 <w:szCs w:val="14"/>
               </w:rPr>
-              <w:t xml:space="preserve">Nombre legal registrado en el RUC. No el nombre comercial del Aviso de Operación.</w:t>
+              <w:t xml:space="preserve">Nombre legal registrado en el RUC</w:t>
+            </w:r>
+          </w:p>
+        </w:tc>
+        <w:tc>
+          <w:tcPr>
+            <w:tcW w:type="dxa" w:w="6800"/>
+            <w:tcMar>
+              <w:top w:type="dxa" w:w="90"/>
+              <w:left w:type="dxa" w:w="140"/>
+              <w:bottom w:type="dxa" w:w="90"/>
+              <w:right w:type="dxa" w:w="140"/>
+            </w:tcMar>
+            <w:vAlign w:val="center"/>
+          </w:tcPr>
+          <w:p>
+            <w:pPr>
+              <w:spacing w:after="20" w:before="20"/>
+              <w:jc w:val="left"/>
+            </w:pPr>
+            <w:r>
+              <w:rPr>
+                <w:rFonts w:ascii="Arial" w:cs="Arial" w:eastAsia="Arial" w:hAnsi="Arial"/>
+                <w:b/>
+                <w:bCs/>
+                <w:i w:val="false"/>
+                <w:iCs w:val="false"/>
+                <w:caps w:val="false"/>
+                <w:color w:val="1A1A1A"/>
+                <w:sz w:val="20"/>
+                <w:szCs w:val="20"/>
+              </w:rPr>
+              <w:t xml:space="preserve">ELITE GUARD, S.A.</w:t>
+            </w:r>
+          </w:p>
+        </w:tc>
+      </w:tr>
+      <w:tr>
+        <w:tc>
+          <w:tcPr>
+            <w:tcW w:type="dxa" w:w="4000"/>
+            <w:shd w:fill="F2F2F2" w:color="auto" w:val="clear"/>
+            <w:tcMar>
+              <w:top w:type="dxa" w:w="90"/>
+              <w:left w:type="dxa" w:w="140"/>
+              <w:bottom w:type="dxa" w:w="90"/>
+              <w:right w:type="dxa" w:w="140"/>
+            </w:tcMar>
+            <w:vAlign w:val="center"/>
+          </w:tcPr>
+          <w:p>
+            <w:pPr>
+              <w:spacing w:after="20" w:before="20"/>
+              <w:jc w:val="left"/>
+            </w:pPr>
+            <w:r>
+              <w:rPr>
+                <w:rFonts w:ascii="Arial" w:cs="Arial" w:eastAsia="Arial" w:hAnsi="Arial"/>
+                <w:b/>
+                <w:bCs/>
+                <w:i w:val="false"/>
+                <w:iCs w:val="false"/>
+                <w:caps w:val="false"/>
+                <w:color w:val="1A1A1A"/>
+                <w:sz w:val="17"/>
+                <w:szCs w:val="17"/>
+              </w:rPr>
+              <w:t xml:space="preserve">RUC y dígito verificador (DV)</w:t>
+            </w:r>
+          </w:p>
+        </w:tc>
+        <w:tc>
+          <w:tcPr>
+            <w:tcW w:type="dxa" w:w="6800"/>
+            <w:tcMar>
+              <w:top w:type="dxa" w:w="90"/>
+              <w:left w:type="dxa" w:w="140"/>
+              <w:bottom w:type="dxa" w:w="90"/>
+              <w:right w:type="dxa" w:w="140"/>
+            </w:tcMar>
+            <w:vAlign w:val="center"/>
+          </w:tcPr>
+          <w:p>
+            <w:pPr>
+              <w:spacing w:after="20" w:before="20"/>
+              <w:jc w:val="left"/>
+            </w:pPr>
+            <w:r>
+              <w:rPr>
+                <w:rFonts w:ascii="Arial" w:cs="Arial" w:eastAsia="Arial" w:hAnsi="Arial"/>
+                <w:b/>
+                <w:bCs/>
+                <w:i w:val="false"/>
+                <w:iCs w:val="false"/>
+                <w:caps w:val="false"/>
+                <w:color w:val="1A1A1A"/>
+                <w:sz w:val="20"/>
+                <w:szCs w:val="20"/>
+              </w:rPr>
+              <w:t xml:space="preserve">155742060-2-2023   DV 50</w:t>
+            </w:r>
+          </w:p>
+        </w:tc>
+      </w:tr>
+      <w:tr>
+        <w:tc>
+          <w:tcPr>
+            <w:tcW w:type="dxa" w:w="4000"/>
+            <w:shd w:fill="F2F2F2" w:color="auto" w:val="clear"/>
+            <w:tcMar>
+              <w:top w:type="dxa" w:w="90"/>
+              <w:left w:type="dxa" w:w="140"/>
+              <w:bottom w:type="dxa" w:w="90"/>
+              <w:right w:type="dxa" w:w="140"/>
+            </w:tcMar>
+            <w:vAlign w:val="center"/>
+          </w:tcPr>
+          <w:p>
+            <w:pPr>
+              <w:spacing w:after="20" w:before="20"/>
+              <w:jc w:val="left"/>
+            </w:pPr>
+            <w:r>
+              <w:rPr>
+                <w:rFonts w:ascii="Arial" w:cs="Arial" w:eastAsia="Arial" w:hAnsi="Arial"/>
+                <w:b/>
+                <w:bCs/>
+                <w:i w:val="false"/>
+                <w:iCs w:val="false"/>
+                <w:caps w:val="false"/>
+                <w:color w:val="1A1A1A"/>
+                <w:sz w:val="17"/>
+                <w:szCs w:val="17"/>
+              </w:rPr>
+              <w:t xml:space="preserve">N.° de Aviso de Operación</w:t>
             </w:r>
           </w:p>
         </w:tc>
@@ -375,7 +509,7 @@
                 <w:sz w:val="17"/>
                 <w:szCs w:val="17"/>
               </w:rPr>
-              <w:t xml:space="preserve">RUC y dígito verificador (DV)</w:t>
+              <w:t xml:space="preserve">N.° patronal (Caja de Seguro Social)</w:t>
             </w:r>
           </w:p>
         </w:tc>
@@ -440,7 +574,7 @@
                 <w:sz w:val="17"/>
                 <w:szCs w:val="17"/>
               </w:rPr>
-              <w:t xml:space="preserve">N.° de Aviso de Operación</w:t>
+              <w:t xml:space="preserve">Dirección</w:t>
             </w:r>
           </w:p>
         </w:tc>
@@ -505,7 +639,7 @@
                 <w:sz w:val="17"/>
                 <w:szCs w:val="17"/>
               </w:rPr>
-              <w:t xml:space="preserve">N.° patronal (Caja de Seguro Social)</w:t>
+              <w:t xml:space="preserve">Persona autorizada</w:t>
             </w:r>
           </w:p>
         </w:tc>
@@ -530,12 +664,14 @@
                 <w:rFonts w:ascii="Arial" w:cs="Arial" w:eastAsia="Arial" w:hAnsi="Arial"/>
                 <w:b/>
                 <w:bCs/>
-                <w:color w:val="2F5BA8"/>
+                <w:i w:val="false"/>
+                <w:iCs w:val="false"/>
+                <w:caps w:val="false"/>
+                <w:color w:val="1A1A1A"/>
                 <w:sz w:val="20"/>
                 <w:szCs w:val="20"/>
-                <w:u w:val="single"/>
-              </w:rPr>
-              <w:t xml:space="preserve">                                                                      </w:t>
+              </w:rPr>
+              <w:t xml:space="preserve">MICHAEL ROSENTHAL</w:t>
             </w:r>
           </w:p>
         </w:tc>
@@ -570,7 +706,7 @@
                 <w:sz w:val="17"/>
                 <w:szCs w:val="17"/>
               </w:rPr>
-              <w:t xml:space="preserve">Dirección</w:t>
+              <w:t xml:space="preserve">Teléfono</w:t>
             </w:r>
           </w:p>
         </w:tc>
@@ -595,12 +731,14 @@
                 <w:rFonts w:ascii="Arial" w:cs="Arial" w:eastAsia="Arial" w:hAnsi="Arial"/>
                 <w:b/>
                 <w:bCs/>
-                <w:color w:val="2F5BA8"/>
+                <w:i w:val="false"/>
+                <w:iCs w:val="false"/>
+                <w:caps w:val="false"/>
+                <w:color w:val="1A1A1A"/>
                 <w:sz w:val="20"/>
                 <w:szCs w:val="20"/>
-                <w:u w:val="single"/>
-              </w:rPr>
-              <w:t xml:space="preserve">                                                                      </w:t>
+              </w:rPr>
+              <w:t xml:space="preserve">(507) 6796-9787</w:t>
             </w:r>
           </w:p>
         </w:tc>
@@ -635,7 +773,7 @@
                 <w:sz w:val="17"/>
                 <w:szCs w:val="17"/>
               </w:rPr>
-              <w:t xml:space="preserve">Persona autorizada y cargo</w:t>
+              <w:t xml:space="preserve">Correo electrónico</w:t>
             </w:r>
           </w:p>
         </w:tc>
@@ -660,142 +798,14 @@
                 <w:rFonts w:ascii="Arial" w:cs="Arial" w:eastAsia="Arial" w:hAnsi="Arial"/>
                 <w:b/>
                 <w:bCs/>
-                <w:color w:val="2F5BA8"/>
+                <w:i w:val="false"/>
+                <w:iCs w:val="false"/>
+                <w:caps w:val="false"/>
+                <w:color w:val="1A1A1A"/>
                 <w:sz w:val="20"/>
                 <w:szCs w:val="20"/>
-                <w:u w:val="single"/>
-              </w:rPr>
-              <w:t xml:space="preserve">                                                                      </w:t>
-            </w:r>
-          </w:p>
-        </w:tc>
-      </w:tr>
-      <w:tr>
-        <w:tc>
-          <w:tcPr>
-            <w:tcW w:type="dxa" w:w="4000"/>
-            <w:shd w:fill="F2F2F2" w:color="auto" w:val="clear"/>
-            <w:tcMar>
-              <w:top w:type="dxa" w:w="90"/>
-              <w:left w:type="dxa" w:w="140"/>
-              <w:bottom w:type="dxa" w:w="90"/>
-              <w:right w:type="dxa" w:w="140"/>
-            </w:tcMar>
-            <w:vAlign w:val="center"/>
-          </w:tcPr>
-          <w:p>
-            <w:pPr>
-              <w:spacing w:after="20" w:before="20"/>
-              <w:jc w:val="left"/>
-            </w:pPr>
-            <w:r>
-              <w:rPr>
-                <w:rFonts w:ascii="Arial" w:cs="Arial" w:eastAsia="Arial" w:hAnsi="Arial"/>
-                <w:b/>
-                <w:bCs/>
-                <w:i w:val="false"/>
-                <w:iCs w:val="false"/>
-                <w:caps w:val="false"/>
-                <w:color w:val="1A1A1A"/>
-                <w:sz w:val="17"/>
-                <w:szCs w:val="17"/>
-              </w:rPr>
-              <w:t xml:space="preserve">Teléfono</w:t>
-            </w:r>
-          </w:p>
-        </w:tc>
-        <w:tc>
-          <w:tcPr>
-            <w:tcW w:type="dxa" w:w="6800"/>
-            <w:tcMar>
-              <w:top w:type="dxa" w:w="90"/>
-              <w:left w:type="dxa" w:w="140"/>
-              <w:bottom w:type="dxa" w:w="90"/>
-              <w:right w:type="dxa" w:w="140"/>
-            </w:tcMar>
-            <w:vAlign w:val="center"/>
-          </w:tcPr>
-          <w:p>
-            <w:pPr>
-              <w:spacing w:after="20" w:before="20"/>
-              <w:jc w:val="left"/>
-            </w:pPr>
-            <w:r>
-              <w:rPr>
-                <w:rFonts w:ascii="Arial" w:cs="Arial" w:eastAsia="Arial" w:hAnsi="Arial"/>
-                <w:b/>
-                <w:bCs/>
-                <w:color w:val="2F5BA8"/>
-                <w:sz w:val="20"/>
-                <w:szCs w:val="20"/>
-                <w:u w:val="single"/>
-              </w:rPr>
-              <w:t xml:space="preserve">                                                                      </w:t>
-            </w:r>
-          </w:p>
-        </w:tc>
-      </w:tr>
-      <w:tr>
-        <w:tc>
-          <w:tcPr>
-            <w:tcW w:type="dxa" w:w="4000"/>
-            <w:shd w:fill="F2F2F2" w:color="auto" w:val="clear"/>
-            <w:tcMar>
-              <w:top w:type="dxa" w:w="90"/>
-              <w:left w:type="dxa" w:w="140"/>
-              <w:bottom w:type="dxa" w:w="90"/>
-              <w:right w:type="dxa" w:w="140"/>
-            </w:tcMar>
-            <w:vAlign w:val="center"/>
-          </w:tcPr>
-          <w:p>
-            <w:pPr>
-              <w:spacing w:after="20" w:before="20"/>
-              <w:jc w:val="left"/>
-            </w:pPr>
-            <w:r>
-              <w:rPr>
-                <w:rFonts w:ascii="Arial" w:cs="Arial" w:eastAsia="Arial" w:hAnsi="Arial"/>
-                <w:b/>
-                <w:bCs/>
-                <w:i w:val="false"/>
-                <w:iCs w:val="false"/>
-                <w:caps w:val="false"/>
-                <w:color w:val="1A1A1A"/>
-                <w:sz w:val="17"/>
-                <w:szCs w:val="17"/>
-              </w:rPr>
-              <w:t xml:space="preserve">Correo electrónico</w:t>
-            </w:r>
-          </w:p>
-        </w:tc>
-        <w:tc>
-          <w:tcPr>
-            <w:tcW w:type="dxa" w:w="6800"/>
-            <w:tcMar>
-              <w:top w:type="dxa" w:w="90"/>
-              <w:left w:type="dxa" w:w="140"/>
-              <w:bottom w:type="dxa" w:w="90"/>
-              <w:right w:type="dxa" w:w="140"/>
-            </w:tcMar>
-            <w:vAlign w:val="center"/>
-          </w:tcPr>
-          <w:p>
-            <w:pPr>
-              <w:spacing w:after="20" w:before="20"/>
-              <w:jc w:val="left"/>
-            </w:pPr>
-            <w:r>
-              <w:rPr>
-                <w:rFonts w:ascii="Arial" w:cs="Arial" w:eastAsia="Arial" w:hAnsi="Arial"/>
-                <w:b/>
-                <w:bCs/>
-                <w:color w:val="2F5BA8"/>
-                <w:sz w:val="20"/>
-                <w:szCs w:val="20"/>
-                <w:u w:val="single"/>
-              </w:rPr>
-              <w:t xml:space="preserve">                                                                      </w:t>
+              </w:rPr>
+              <w:t xml:space="preserve">ventas@eliteguardsa.com</w:t>
             </w:r>
           </w:p>
         </w:tc>
@@ -3875,6 +3885,26 @@
             <w:r>
               <w:rPr>
                 <w:rFonts w:ascii="Arial" w:cs="Arial" w:eastAsia="Arial" w:hAnsi="Arial"/>
+                <w:b/>
+                <w:bCs/>
+                <w:i w:val="false"/>
+                <w:iCs w:val="false"/>
+                <w:caps w:val="false"/>
+                <w:color w:val="1A1A1A"/>
+                <w:sz w:val="17"/>
+                <w:szCs w:val="17"/>
+              </w:rPr>
+              <w:t xml:space="preserve">MICHAEL ROSENTHAL — ELITE GUARD, S.A.</w:t>
+            </w:r>
+          </w:p>
+          <w:p>
+            <w:pPr>
+              <w:spacing w:after="20" w:before="20"/>
+              <w:jc w:val="left"/>
+            </w:pPr>
+            <w:r>
+              <w:rPr>
+                <w:rFonts w:ascii="Arial" w:cs="Arial" w:eastAsia="Arial" w:hAnsi="Arial"/>
                 <w:b w:val="false"/>
                 <w:bCs w:val="false"/>
                 <w:i w:val="false"/>
@@ -3917,6 +3947,26 @@
                 <w:szCs w:val="19"/>
               </w:rPr>
               <w:t xml:space="preserve">_______________________________</w:t>
+            </w:r>
+          </w:p>
+          <w:p>
+            <w:pPr>
+              <w:spacing w:after="20" w:before="20"/>
+              <w:jc w:val="left"/>
+            </w:pPr>
+            <w:r>
+              <w:rPr>
+                <w:rFonts w:ascii="Arial" w:cs="Arial" w:eastAsia="Arial" w:hAnsi="Arial"/>
+                <w:b/>
+                <w:bCs/>
+                <w:i w:val="false"/>
+                <w:iCs w:val="false"/>
+                <w:caps w:val="false"/>
+                <w:color w:val="1A1A1A"/>
+                <w:sz w:val="17"/>
+                <w:szCs w:val="17"/>
+              </w:rPr>
+              <w:t xml:space="preserve">6 de octubre de 2026</w:t>
             </w:r>
           </w:p>
           <w:p>

</xml_diff>